<commit_message>
Đổi tên hai vai: yard là "Admin Thà Bốc", admin là "Sếp (xem tất cả)"
Anh chốt gọi người quản lý tại bãi là ADMIN THÀ BỐC (không phải cái bãi), và tài khoản admin là SẾP.
Mã vai trong dữ liệu giữ nguyên `yard` và `admin`, chỉ đổi NHÃN nên không phải chuyển dữ liệu.

- Ghi đè nhãn ở KHOA_MOI trong tools/sinh_ngon_ngu.py chứ không sửa tu_dien_mau_vi_lo.json (tệp đó
  chép nguyên từ bản mẫu bên Lào): r_yard, r_admin, user_role, hint_yard, hint_admin, và các chỗ
  cùng tên vai — wf1d (bước 1 trên phiếu), sg_issuer_d (ô ký người lập), lg_yard, lg_g_admin (tên
  nhóm ở màn đăng nhập, nay là "Sếp"). Tiếng Lào: ແອັດມິນ ທ່າບົກ · ຫົວໜ້າ (ghép từ cụm đã có).
- Câu báo lỗi người dùng đọc được trong routes/phieu.py, chú thích vai trong models.py và
  services/phan_quyen.py, tài liệu README + BAN_DO_CHUC_NANG + CHUNG_TU_VA_DIEM_NOI (kèm .docx) và
  các bộ kiểm đều gọi theo tên mới.

Co-Authored-By: Claude Opus 5 (1M context) <noreply@anthropic.com>
</commit_message>
<xml_diff>
--- a/DOCS/BAN_DO_CHUC_NANG.docx
+++ b/DOCS/BAN_DO_CHUC_NANG.docx
@@ -164,7 +164,7 @@
         <w:t>Chuỗi duyệt theo vai</w:t>
       </w:r>
       <w:r>
-        <w:t>: Bãi Thà Bốc nhập → Kế toán Viêng Chăn kiểm → ghi sổ → Quỹ chi. Mỗi khoản chi có mã tài khoản kép (</w:t>
+        <w:t>: Admin Thà Bốc nhập → Kế toán Viêng Chăn kiểm → ghi sổ → Quỹ chi. Mỗi khoản chi có mã tài khoản kép (</w:t>
       </w:r>
       <w:r>
         <w:rPr>
@@ -1808,7 +1808,7 @@
           <w:p>
             <w:r/>
             <w:r>
-              <w:t>ສະໜາມທ່າບົກ — Bãi Thà Bốc</w:t>
+              <w:t>ສະໜາມທ່າບົກ — Admin Thà Bốc</w:t>
             </w:r>
           </w:p>
         </w:tc>

</xml_diff>

<commit_message>
Dọn DOCS: xoá tài liệu đã bị thay thế, gắn cảnh báo lỗi thời, sinh lại Word cũ
- XOÁ CHUNG_TU_VA_DIEM_NOI.md/.docx (18/09): nội dung đã nằm gọn trong
  NGHIEP_VU_DB_API.md (ai nhập ô nào ở A1, bảng chứng từ ở A6) và
  HOP_DONG_API_ANH_KHANG.md; bản cũ còn thiếu ba loại chứng từ mới (PNK_HH,
  PXK_HH, DC_HH) và chưa biết luồng hai DO nên đọc vào là hiểu sai. README trỏ
  sang hai tệp mới.
- PHAN_TICH_LUONG_DO_VA_VAI.md: gắn cảnh báo ở đầu — dòng K1 và mục 3 viết theo
  phương án cũ "một phiếu cả vòng", đã bị quyết định hai DO ngày 21/09 thay thế.
  Giữ tệp vì phần đối chiếu Excel và bảng Nhiệm Vụ vẫn dùng được.
- BAN_DO_CHUC_NANG.md: sửa số khoá từ điển 741 → hơn 1.100.
- Sinh lại ba bản Word đang cũ hơn bản Markdown của chính nó.

Co-Authored-By: Claude Opus 5 (1M context) <noreply@anthropic.com>
</commit_message>
<xml_diff>
--- a/DOCS/BAN_DO_CHUC_NANG.docx
+++ b/DOCS/BAN_DO_CHUC_NANG.docx
@@ -731,7 +731,16 @@
           <w:p>
             <w:r/>
             <w:r>
-              <w:t>Danh mục duy nhất họ còn dùng — anh đã nói *"chỉ giữ lại được khách hàng"*</w:t>
+              <w:t xml:space="preserve">Danh mục duy nhất họ còn dùng — anh đã nói *"chỉ giữ lại được khách hàng"*. Thêm </w:t>
+            </w:r>
+            <w:r>
+              <w:rPr>
+                <w:b/>
+              </w:rPr>
+              <w:t>bảng giá khách × tuyến</w:t>
+            </w:r>
+            <w:r>
+              <w:t xml:space="preserve"> (USD/tấn, ngày hiệu lực): mở phiếu chọn khách và tuyến là tự điền đơn giá; Bãi không thấy</w:t>
             </w:r>
           </w:p>
         </w:tc>
@@ -4955,7 +4964,7 @@
         <w:t>Ngôn ngữ</w:t>
       </w:r>
       <w:r>
-        <w:t xml:space="preserve">: Việt · Lào · Anh · Việt+Lào, từ điển 741 khoá trong </w:t>
+        <w:t xml:space="preserve">: Việt · Lào · Anh · Việt+Lào, từ điển hơn 1.100 khoá trong </w:t>
       </w:r>
       <w:r>
         <w:rPr>
@@ -4965,7 +4974,17 @@
         <w:t>js/ngon_ngu.js</w:t>
       </w:r>
       <w:r>
-        <w:t>. Chữ Lào chép nguyên từ bản mẫu bên Lào đã duyệt.</w:t>
+        <w:t xml:space="preserve"> (sinh tự động bởi </w:t>
+      </w:r>
+      <w:r>
+        <w:rPr>
+          <w:rFonts w:ascii="Consolas" w:hAnsi="Consolas"/>
+          <w:sz w:val="19"/>
+        </w:rPr>
+        <w:t>tools/sinh_ngon_ngu.py</w:t>
+      </w:r>
+      <w:r>
+        <w:t>). Chữ Lào chép nguyên từ bản mẫu bên Lào đã duyệt.</w:t>
       </w:r>
     </w:p>
     <w:p>
@@ -4993,17 +5012,7 @@
         <w:t>Màn đăng nhập</w:t>
       </w:r>
       <w:r>
-        <w:t xml:space="preserve"> dựng theo bản mẫu </w:t>
-      </w:r>
-      <w:r>
-        <w:rPr>
-          <w:rFonts w:ascii="Consolas" w:hAnsi="Consolas"/>
-          <w:sz w:val="19"/>
-        </w:rPr>
-        <w:t>frontend/modules/epl-login-page</w:t>
-      </w:r>
-      <w:r>
-        <w:t>: nửa trái là thương hiệu</w:t>
+        <w:t xml:space="preserve"> dựng theo bản mẫu đăng nhập anh gửi (đã bỏ khỏi dự án): nửa trái là thương hiệu</w:t>
       </w:r>
     </w:p>
     <w:p>

</xml_diff>